<commit_message>
Correct the project report after a fact-check against the code and results
LoRA wraps the merged qkv projection, not q and v separately. SAMed keeps
SAM's mask decoder; this project swaps in a CNN decoder. The test suite
has 70 GPU-free tests, not 24. U-Net is ImageNet-initialized, not trained
from scratch. Seed spreads are 0.004 to 0.011. Causal and novelty claims
are softened to what three seeds on one benchmark family support.
</commit_message>
<xml_diff>
--- a/docs/PROJECT_REPORT.docx
+++ b/docs/PROJECT_REPORT.docx
@@ -61,10 +61,10 @@
         <w:rPr>
           <w:b/>
         </w:rPr>
-        <w:t>SAM-ViT-H + LoRA generalizes best.</w:t>
+        <w:t>SAM-ViT-H + LoRA scores highest on the unseen splits.</w:t>
       </w:r>
       <w:r>
-        <w:t xml:space="preserve"> It reaches 0.806 mean Dice on the three unseen datasets against U-Net's 0.755, and its seen-to-unseen drop (0.082) is about half of U-Net's (0.145). It trains 830,177 parameters, about 3% of the 24.4M that U-Net trains from scratch.</w:t>
+        <w:t xml:space="preserve"> It reaches 0.806 mean Dice on the three unseen datasets against U-Net's 0.755, and its seen-to-unseen drop (0.082) is about half of U-Net's (0.145). It trains 830,177 parameters, about 3% of the 24.4M that the ImageNet-initialized U-Net trains end-to-end.</w:t>
       </w:r>
     </w:p>
     <w:p>
@@ -106,7 +106,7 @@
         <w:t>Prompt dependence quantified.</w:t>
       </w:r>
       <w:r>
-        <w:t xml:space="preserve"> With its two contracts honored (a box prompt and min-max inputs), untrained MedSAM posts the best unseen number in the study (0.925). A ground-truth box lifts SAM-ViT-H by +0.099 but lifts corrected MedSAM by +0.200. MedSAM is a specialized model, and it pays for the specialization exactly when the box is taken away.</w:t>
+        <w:t xml:space="preserve"> With its two contracts honored (a box prompt and min-max inputs), untrained MedSAM posts the best unseen number in the study (0.925). A ground-truth box lifts SAM-ViT-H by +0.099 but lifts corrected MedSAM by +0.200. MedSAM is a specialized model, and the pattern is consistent with an encoder that relies on the box for localization and pays when the box is taken away.</w:t>
       </w:r>
     </w:p>
     <w:p>
@@ -141,7 +141,7 @@
         <w:t>Segmentation foundation models.</w:t>
       </w:r>
       <w:r>
-        <w:t xml:space="preserve"> SAM [4] trained a ViT image encoder and a promptable mask decoder on SA-1B, a corpus of 11M images and 1.1B masks. Zero-shot SAM segments natural images well but underperforms on medical imagery, where object boundaries follow tissue contrast rather than natural-image edges. MedSAM [5] fine-tuned SAM ViT-B on about 1.57M medical image-mask pairs across ten modalities and reported specialist-level accuracy on endoscopy, with one structural condition: every training step supplied a bounding-box prompt. The model was never asked to localize an object on its own.</w:t>
+        <w:t xml:space="preserve"> SAM [4] trained a ViT image encoder and a promptable mask decoder on SA-1B, a corpus of 11M images and 1.1B masks. Zero-shot SAM segments natural images well but underperforms on medical imagery, where object boundaries follow tissue contrast rather than natural-image edges. MedSAM [5] fine-tuned SAM ViT-B on about 1.57M medical image-mask pairs across ten modalities and reported accuracy above per-modality specialist U-Net and DeepLabV3+ baselines, endoscopy included [5], with one structural condition: every training step supplied a bounding-box prompt. The model was never asked to localize an object on its own.</w:t>
       </w:r>
     </w:p>
     <w:p>
@@ -152,7 +152,7 @@
         <w:t>Parameter-efficient fine-tuning.</w:t>
       </w:r>
       <w:r>
-        <w:t xml:space="preserve"> LoRA [6] freezes a pretrained weight matrix and learns a low-rank update, which cuts trainable parameters by orders of magnitude while it keeps the pretrained representation intact. SAMed [7] applied LoRA to a frozen SAM encoder for medical segmentation and is the method this project adapts: LoRA on the attention projections, a lightweight convolutional decoder, no prompts at inference.</w:t>
+        <w:t xml:space="preserve"> LoRA [6] freezes a pretrained weight matrix and learns a low-rank update, which cuts trainable parameters by orders of magnitude while it keeps the pretrained representation intact. SAMed [7] applied LoRA to a frozen SAM encoder for medical segmentation and is the method this project adapts: LoRA on the attention projections, a no prompts at inference. SAMed keeps and fine-tunes SAM's own mask decoder; this project replaces that decoder with a small CNN decoder, which is the one departure from the SAMed recipe.</w:t>
       </w:r>
     </w:p>
     <w:p>
@@ -172,7 +172,7 @@
         <w:t>generalization</w:t>
       </w:r>
       <w:r>
-        <w:t>, measured on the same seen/unseen protocol the specialists were built on, under one training protocol, with the cost of each option recorded. Two published claims also sit in tension: MedSAM reports beating specialists on endoscopy, and the PraNet protocol is exactly the setting where that claim can be tested without a prompt oracle. Nobody had run that test. This study does.</w:t>
+        <w:t>, measured on the same seen/unseen protocol the specialists were built on, under one training protocol, with the cost of each option recorded. Two published claims also sit in tension: MedSAM reports beating its specialist baselines on endoscopy, and the PraNet protocol is exactly the setting where that claim can be tested without a prompt oracle. I did not find a published run of that test. This study runs it.</w:t>
       </w:r>
     </w:p>
     <w:p>
@@ -327,7 +327,16 @@
     </w:p>
     <w:p>
       <w:r>
-        <w:t>The study follows the PraNet five-split protocol exactly.</w:t>
+        <w:t xml:space="preserve">The study follows the PraNet five-split protocol: the same five datasets and the same split sizes, as configured in </w:t>
+      </w:r>
+      <w:r>
+        <w:rPr>
+          <w:rFonts w:ascii="Consolas" w:hAnsi="Consolas"/>
+        </w:rPr>
+        <w:t>configs/base.yaml</w:t>
+      </w:r>
+      <w:r>
+        <w:t>.</w:t>
       </w:r>
     </w:p>
     <w:tbl>
@@ -879,7 +888,7 @@
     <w:p/>
     <w:p>
       <w:r>
-        <w:t>The LoRA models follow SAMed: the ViT encoder is frozen, rank-4 LoRA (alpha 8, dropout 0.1) is injected into the attention query and value projections, and a lightweight CNN decoder reads a mask from the encoder features with no prompt at inference. SAM-ViT-B + LoRA shares MedSAM's backbone size but keeps generic SAM weights, so the pair separates backbone capacity from pretraining source. Two caveats bound these pairings, and I want them stated before the results rather than after. The LoRA parameter count scales with the backbone (830K on ViT-H against 322K on ViT-B), so the size comparison moves adapter capacity together with backbone capacity. And MedSAM's starting weights bundle two changes its authors made together, medical training data and a box prompt supplied on every training example, so the pretraining pair measures the checkpoint as delivered, not the medical data alone.</w:t>
+        <w:t>The LoRA models adapt the SAMed recipe: the ViT encoder is frozen, rank-4 LoRA (alpha 8, dropout 0.1) wraps the merged query/key/value projection of every encoder attention block (one shared low-rank update across Q, K, and V, since SAM's encoder stores them as one linear layer), and a small CNN decoder reads a mask from the encoder features with no prompt at inference. SAMed targets Q and V separately and keeps SAM's mask decoder; both differences are noted in Section 7. SAM-ViT-B + LoRA shares MedSAM's backbone size but keeps generic SAM weights, so the pair separates backbone capacity from pretraining source. Two caveats bound these pairings, and I want them stated before the results rather than after. The LoRA parameter count scales with the backbone (830K on ViT-H against 322K on ViT-B), so the size comparison moves adapter capacity together with backbone capacity. And MedSAM's starting weights bundle two changes its authors made together, medical training data and a box prompt supplied on every training example, so the pretraining pair measures the checkpoint as delivered, not the medical data alone.</w:t>
       </w:r>
     </w:p>
     <w:p>
@@ -892,7 +901,7 @@
     </w:p>
     <w:p>
       <w:r>
-        <w:t xml:space="preserve">All trained models share one protocol: 352×352 inputs, batch size 4, AdamW (learning rate 5e-5, weight decay 1e-4), cosine schedule, combined Dice + BCE loss, up to 50 epochs with early stopping at patience 8, checkpoint selection by best validation Dice, three seeds (42, 43, 44), one NVIDIA A100-SXM4-40GB. Augmentation: flips, rotation, and color jitter via Albumentations. Input normalization is bound to the model key: ImageNet standardization for SAM and U-Net (this reproduces SAM's native </w:t>
+        <w:t xml:space="preserve">All trained models share one protocol: 352×352 inputs, batch size 4, AdamW (learning rate 5e-5, weight decay 1e-4), cosine schedule, combined Dice + BCE loss, up to 50 epochs with early stopping at patience 8, checkpoint selection by best validation Dice, three seeds (42, 43, 44), one NVIDIA A100-SXM4-40GB. Augmentation: flips, rotation, and color jitter via Albumentations. Input normalization is bound to the model key: ImageNet standardization for SAM and U-Net (the same mean and std that SAM's native </w:t>
       </w:r>
       <w:r>
         <w:rPr>
@@ -901,7 +910,7 @@
         <w:t>preprocess</w:t>
       </w:r>
       <w:r>
-        <w:t>), per-image min-max [0,1] for the corrected MedSAM arms (MedSAM's native contract).</w:t>
+        <w:t xml:space="preserve"> applies), per-image min-max [0,1] for the corrected MedSAM arms (MedSAM's native contract).</w:t>
       </w:r>
     </w:p>
     <w:p>
@@ -936,7 +945,16 @@
     </w:p>
     <w:p>
       <w:r>
-        <w:t>Four untrained baselines run inference only, prompted with a bounding box derived from the ground-truth mask (5 px padding): vanilla SAM ViT-H, vanilla SAM ViT-B, vanilla MedSAM under ImageNet normalization, and vanilla MedSAM under its own min-max normalization. The ground-truth box reveals the polyp's location, so these numbers form an upper bound. I keep them in a separate tier and never rank them against the trained models. The box protocol is standard in the medical-SAM literature, and I confirmed it with my professor before the final runs.</w:t>
+        <w:t>Four untrained baselines run inference only, prompted with a bounding box derived from the ground-truth mask (5 px padding): vanilla SAM ViT-H, vanilla SAM ViT-B, vanilla MedSAM under ImageNet normalization, and vanilla MedSAM under its own min-max normalization. The ground-truth box reveals the polyp's location, so these numbers form an upper bound. I keep them in a separate tier and never rank them against the trained models. The box protocol is standard in the medical-SAM literature, and I confirmed it with my advisor before the final runs (</w:t>
+      </w:r>
+      <w:r>
+        <w:rPr>
+          <w:rFonts w:ascii="Consolas" w:hAnsi="Consolas"/>
+        </w:rPr>
+        <w:t>docs/PROJECT_PLAN.md</w:t>
+      </w:r>
+      <w:r>
+        <w:t>).</w:t>
       </w:r>
     </w:p>
     <w:p>
@@ -1223,7 +1241,7 @@
         <w:t>configs/base.yaml</w:t>
       </w:r>
       <w:r>
-        <w:t xml:space="preserve"> holds shared hyperparameters; </w:t>
+        <w:t xml:space="preserve"> holds the defaults and the per-model blocks; </w:t>
       </w:r>
       <w:r>
         <w:rPr>
@@ -1232,7 +1250,7 @@
         <w:t>configs/run.yaml</w:t>
       </w:r>
       <w:r>
-        <w:t xml:space="preserve"> selects the model, seed, and output paths. </w:t>
+        <w:t xml:space="preserve"> holds the values the study actually used (batch size, epochs, learning rate, patience) and selects the model, seed, and output paths. </w:t>
       </w:r>
       <w:r>
         <w:rPr>
@@ -1402,7 +1420,7 @@
         <w:t>Prompt protocol for the untrained tier.</w:t>
       </w:r>
       <w:r>
-        <w:t xml:space="preserve"> A zero-shot SAM needs a prompt. A ground-truth box is an oracle: it hands the model the location. The tradeoff was between dropping the untrained tier, which loses the upper bound, and reporting it next to trained models, which invites a false comparison. I took a third route: keep the oracle tier in a separate table, flag the negative seen-to-unseen gap as the sign that these numbers track split difficulty rather than learning, and get my professor's sign-off on the box protocol before the final runs.</w:t>
+        <w:t xml:space="preserve"> A zero-shot SAM needs a prompt. A ground-truth box is an oracle: it hands the model the location. The tradeoff was between dropping the untrained tier, which loses the upper bound, and reporting it next to trained models, which invites a false comparison. I took a third route: keep the oracle tier in a separate table, flag the negative seen-to-unseen gap as the sign that these numbers track split difficulty rather than learning, and get my advisor's sign-off on the box protocol before the final runs.</w:t>
       </w:r>
     </w:p>
     <w:p>
@@ -1424,7 +1442,7 @@
         <w:t>Testing without a GPU.</w:t>
       </w:r>
       <w:r>
-        <w:t xml:space="preserve"> Prompt-derivation math and the config/aggregation layer are torch-free and covered by 24 unit tests (</w:t>
+        <w:t xml:space="preserve"> Prompt-derivation math and the config/aggregation layer are torch-free and covered by 70 unit tests (</w:t>
       </w:r>
       <w:r>
         <w:rPr>
@@ -2016,7 +2034,7 @@
         <w:t>RQ1 (seen).</w:t>
       </w:r>
       <w:r>
-        <w:t xml:space="preserve"> U-Net wins at home: 0.900 against SAM-ViT-H's 0.887. The specialist fits the training distribution tightest, including the best ClinicDB score of any model (0.897).</w:t>
+        <w:t xml:space="preserve"> U-Net wins at home: 0.900 against SAM-ViT-H's 0.887. The specialist fits the training distribution tightest, including the best ClinicDB score of any trained model (0.897).</w:t>
       </w:r>
     </w:p>
     <w:p>
@@ -2645,7 +2663,7 @@
           </w:tcPr>
           <w:p>
             <w:r>
-              <w:t>jitter off (ImageNet norm fixed)</w:t>
+              <w:t>brightness/contrast jitter off (ImageNet norm fixed)</w:t>
             </w:r>
           </w:p>
         </w:tc>
@@ -2755,7 +2773,7 @@
     <w:p/>
     <w:p>
       <w:r>
-        <w:t>Of MedSAM's original 0.100 unseen deficit against SAM-ViT-B, 0.069 was my preprocessing bug and 0.036 is the residual effect of the MedSAM checkpoint at matched size. That residual and the backbone effect (0.045) are close, and each carries a seed spread near 0.005, so the two read as comparable in size rather than strictly ordered. The checkpoint effect itself bundles MedSAM's medical training data with its box-prompted training objective; Section 6.4 points to the objective as the likely driver. The jitter confound was negligible (0.006), which validates the three-arm design. On this evidence I retracted the earlier claim that medical pretraining is a net drag and accounts for most of the deficit.</w:t>
+        <w:t>Of MedSAM's original 0.100 unseen deficit against SAM-ViT-B, 0.069 was my preprocessing bug and 0.036 is the residual effect of the MedSAM checkpoint at matched size. That residual and the backbone effect (0.045) are close, and the seed spreads behind them run from 0.004 (the ViT-B arms) to 0.011 (SAM-ViT-H), so the two read as comparable in size rather than strictly ordered. The three effects sum to the deficit only with the jitter term included (−0.006 + 0.069 + 0.036 = 0.100). The checkpoint effect itself bundles MedSAM's medical training data with its box-prompted training objective; Section 6.4 points to the objective as the likely driver. The jitter confound was small (0.006), which shows the augmentation interaction did not drive the result. On this evidence I retracted the earlier claim that medical pretraining is a net drag and accounts for most of the deficit.</w:t>
       </w:r>
     </w:p>
     <w:p>
@@ -3012,7 +3030,7 @@
     <w:p/>
     <w:p>
       <w:r>
-        <w:t>I read two things from this table. First, the normalization bug replicates with zero training: the same MedSAM weights score 0.845 unseen under ImageNet inputs and 0.925 under their own min-max (+0.080). Second, with both of its contracts honored, vanilla MedSAM is the strongest model in the study. The negative gaps show that this tier measures split difficulty given a location hint, not generalization: a genuinely generalizing model should not score higher on unseen data than seen data. This is the prompt dependence in numbers: the untrained box-prompted model beats its own trained prompt-free version by +0.099 for SAM-ViT-H (0.806 → 0.905) and by +0.200 for corrected MedSAM (0.725 → 0.925). Two conditions change between those numbers, the box arrives and the LoRA training is absent, so each lift reads as the value of location information net of what training added. MedSAM's fine-tuning always supplied a box, so its encoder never learned to localize; it pays exactly when the box is taken away.</w:t>
+        <w:t>I read two things from this table. First, the normalization bug replicates with zero training: the same MedSAM weights score 0.845 unseen under ImageNet inputs and 0.925 under their own min-max (+0.080). Second, with both of its contracts honored, vanilla MedSAM is the strongest entry in the oracle tier. The negative gaps show that this tier measures split difficulty given a location hint, not generalization: a genuinely generalizing model should not score higher on unseen data than seen data. This is the prompt dependence in numbers: the untrained box-prompted model beats its own trained prompt-free version by +0.099 for SAM-ViT-H (0.806 → 0.905) and by +0.200 for corrected MedSAM (0.725 → 0.925). Two conditions change between those numbers, the box arrives and the LoRA training is absent, so each lift reads as the value of location information net of what training added. MedSAM's fine-tuning always supplied a box. The study measures the lift, not the mechanism, but the size of the lift is consistent with an encoder that relies on the box for localization and pays when the box is taken away.</w:t>
       </w:r>
     </w:p>
     <w:p>
@@ -3028,10 +3046,10 @@
         <w:rPr>
           <w:b/>
         </w:rPr>
-        <w:t>The adaptation trade is real and favorable off-distribution.</w:t>
+        <w:t>The adaptation trade is real and favorable off-distribution, on this benchmark family.</w:t>
       </w:r>
       <w:r>
-        <w:t xml:space="preserve"> The frozen SAM backbone carries visual priors that 1,450 polyp images cannot teach a from-scratch CNN, and rank-4 LoRA is enough to point those priors at the task. The result pattern (specialist wins at home, adapter wins away) matches the deployment question clinics actually face, and the gap metric puts the trade in one line: 3% of the trainable parameters buys half the generalization drop.</w:t>
+        <w:t xml:space="preserve"> The frozen SAM backbone carries visual priors beyond what an ImageNet-initialized CNN picks up from 1,450 polyp images, and the result is consistent with rank-4 LoRA being enough to point those priors at the task. The result pattern (specialist wins at home, adapter wins away) matches the deployment question clinics actually face, and the gap metric puts the trade in one line: 3% of the trainable parameters comes with half the generalization drop.</w:t>
       </w:r>
     </w:p>
     <w:p>
@@ -3042,7 +3060,7 @@
         <w:t>MedSAM is specialized, not weak.</w:t>
       </w:r>
       <w:r>
-        <w:t xml:space="preserve"> The finding I learned the most from is negative in form. MedSAM's published claim (specialist-level endoscopy accuracy) and my measured result (last on every split) are both correct. They measure different contracts. MedSAM with a box and min-max inputs posts the best unseen number here (0.925). MedSAM without the box loses the most, because its fine-tuning let the encoder offload localization to the prompt. A practitioner choosing a model should ask which contract the deployment honors. If no localizer supplies a box at inference, I would pick prompt-free adaptation of generic SAM over medical-pretrained MedSAM at the same size; the 0.036 residual in Section 6.3 is the reason.</w:t>
+        <w:t xml:space="preserve"> The finding I learned the most from is negative in form. MedSAM's published claim (above its specialist baselines on endoscopy) and my measured result (last on every split) are both correct. They measure different contracts. MedSAM with a box and min-max inputs posts the best unseen number here (0.925). MedSAM without the box loses the most, because its fine-tuning let the encoder offload localization to the prompt. A practitioner choosing a model should ask which contract the deployment honors. If no localizer supplies a box at inference, I would pick prompt-free adaptation of generic SAM over medical-pretrained MedSAM at the same size; the 0.036 residual in Section 6.3 is the reason, with the caveat that it rests on one benchmark family and three seeds.</w:t>
       </w:r>
     </w:p>
     <w:p>
@@ -3064,7 +3082,7 @@
         <w:t>Relation to prior work.</w:t>
       </w:r>
       <w:r>
-        <w:t xml:space="preserve"> The result extends SAMed's finding (LoRA on frozen SAM works for medical segmentation) with the measurement SAMed did not make: cross-dataset generalization under the specialists' own protocol. It also gives PraNet's seen/unseen framing a new use, separating model classes rather than ranking specialist variants.</w:t>
+        <w:t xml:space="preserve"> The result builds on SAMed's approach (LoRA on a frozen SAM encoder for medical segmentation) and adds the measurement SAMed did not make: cross-dataset generalization under the specialists' own protocol. Two parts of the recipe differ here, the CNN decoder in place of SAM's mask decoder and LoRA on the merged qkv projection instead of Q and V separately, so the comparison is to SAMed's approach rather than a replication of it. It also gives PraNet's seen/unseen framing a new use, separating model classes rather than ranking specialist variants.</w:t>
       </w:r>
     </w:p>
     <w:p>
@@ -3077,7 +3095,7 @@
     </w:p>
     <w:p>
       <w:r>
-        <w:t>A frozen SAM ViT-H backbone with an 830K-parameter LoRA adapter beats a 24.4M-parameter specialist U-Net on unseen polyp datasets (0.806 vs 0.755 mean Dice) and halves the seen-to-unseen drop (0.082 vs 0.145), while the specialist keeps the edge on seen data and in training cost. Controlled ablations attribute MedSAM's apparent collapse to three measured causes: a 0.069 preprocessing artifact in my own pipeline, a 0.036 residual for the MedSAM checkpoint at matched size, and a 0.045 backbone-size effect, the last two comparable in size, and quantify its prompt dependence (+0.200 from an oracle box against +0.099 for generic SAM).</w:t>
+        <w:t>A frozen SAM ViT-H backbone with an 830K-parameter LoRA adapter scores higher than a 24.4M-parameter ImageNet-initialized U-Net on the three unseen PraNet datasets (0.806 vs 0.755 mean Dice, three seeds, no significance test) and halves the seen-to-unseen drop (0.082 vs 0.145), while the specialist keeps the edge on seen data and in training cost. Controlled ablations attribute MedSAM's apparent collapse to three measured causes: a 0.069 preprocessing artifact in my own pipeline, a 0.036 residual for the MedSAM checkpoint at matched size, and a 0.045 backbone-size effect, the last two comparable in size, and quantify its prompt dependence (+0.200 from an oracle box against +0.099 for generic SAM).</w:t>
       </w:r>
     </w:p>
     <w:p>
@@ -3099,7 +3117,7 @@
         <w:t>Limitations.</w:t>
       </w:r>
       <w:r>
-        <w:t xml:space="preserve"> I want to be direct about what these numbers do not cover. All five splits come from PraNet's datasets, so the results do not speak to colonoscopy data under other equipment or protocols. Three seeds show the spread is real, but the sample is small. The oracle tier has one run per baseline and remains an upper bound, not a peer. Training cost is asymmetric in a way that matters to some deployments (U-Net: 10 min, 98 MB; SAM-H: 120 min, 2.5 GB).</w:t>
+        <w:t xml:space="preserve"> I want to be direct about what these numbers do not cover. No significance test was run; the seed spreads in Section 6.1 are the only uncertainty measure. All five splits come from PraNet's datasets, so the results do not speak to colonoscopy data under other equipment or protocols. Three seeds show the spread is real, but the sample is small. The oracle tier has one run per baseline and remains an upper bound, not a peer. Training cost is asymmetric in a way that matters to some deployments (U-Net: 10 min, 98 MB; SAM-H: 120 min, 2.5 GB).</w:t>
       </w:r>
     </w:p>
     <w:p>
@@ -3533,7 +3551,7 @@
           </w:tcPr>
           <w:p>
             <w:r>
-              <w:t>r = 4, alpha = 8, dropout 0.1, query and value projections</w:t>
+              <w:t>r = 4, alpha = 8, dropout 0.1, merged qkv projection of each encoder attention block</w:t>
             </w:r>
           </w:p>
         </w:tc>
@@ -3746,7 +3764,7 @@
         <w:t>pytest tests/</w:t>
       </w:r>
       <w:r>
-        <w:t xml:space="preserve"> (24 GPU-free tests).</w:t>
+        <w:t xml:space="preserve"> (70 GPU-free tests, plus 8 transform tests that run only where Albumentations is installed).</w:t>
       </w:r>
     </w:p>
     <w:p>

</xml_diff>

<commit_message>
Add the pre-registered ensemble and box-cascade experiment to future work
</commit_message>
<xml_diff>
--- a/docs/PROJECT_REPORT.docx
+++ b/docs/PROJECT_REPORT.docx
@@ -3128,7 +3128,124 @@
         <w:t>Future work.</w:t>
       </w:r>
       <w:r>
-        <w:t xml:space="preserve"> Four directions, in the order I would take them. Evaluate on a benchmark family outside PraNet's five datasets, since that is the limitation that bounds the claim most. Pair MedSAM with a learned box proposer to test whether its 0.925 oracle ceiling is reachable without ground truth; the cascade is cheap because both halves already exist. Probe color sensitivity with the grayscale-replication experiment already designed. Test larger LoRA ranks and target modules.</w:t>
+        <w:t xml:space="preserve"> Four directions, in the order I would take them. The first is already designed and scaffolded; the other three are open.</w:t>
+      </w:r>
+    </w:p>
+    <w:p>
+      <w:r>
+        <w:rPr>
+          <w:i/>
+        </w:rPr>
+        <w:t>1. An ensemble decision system.</w:t>
+      </w:r>
+      <w:r>
+        <w:t xml:space="preserve"> The six trained models make different errors, and the per-split table in Section 6.2 shows where: U-Net wins ClinicDB, SAM-ViT-H wins every unseen split, and MedSAM with a box beats both. The next experiment combines them at inference without reading any ground truth. It has two parts. A </w:t>
+      </w:r>
+      <w:r>
+        <w:rPr>
+          <w:b/>
+        </w:rPr>
+        <w:t>flat ensemble</w:t>
+      </w:r>
+      <w:r>
+        <w:t xml:space="preserve"> averages the probability maps of several trained members before the 0.5 threshold; every model already scores on the same 352 × 352 grid, so the maps average directly. A </w:t>
+      </w:r>
+      <w:r>
+        <w:rPr>
+          <w:b/>
+        </w:rPr>
+        <w:t>box cascade</w:t>
+      </w:r>
+      <w:r>
+        <w:t xml:space="preserve"> uses U-Net's prompt-free mask to derive a bounding box, then hands that box to vanilla MedSAM under min-max normalization. This tests whether the 0.925 oracle ceiling in Section 6.4 is reachable with a learned localizer instead of ground truth.</w:t>
+      </w:r>
+    </w:p>
+    <w:p>
+      <w:r>
+        <w:t xml:space="preserve">The design is pre-registered in </w:t>
+      </w:r>
+      <w:r>
+        <w:rPr>
+          <w:rFonts w:ascii="Consolas" w:hAnsi="Consolas"/>
+        </w:rPr>
+        <w:t>docs/PLAN_ENSEMBLE.md</w:t>
+      </w:r>
+      <w:r>
+        <w:t xml:space="preserve"> so that the result cannot be tuned after the fact. Two member sets are fixed in advance: set A is U-Net plus SAM-ViT-H, the largest architectural distance in the study; set B is the top three prompt-free rows (SAM-ViT-H, SAM-ViT-B, U-Net). Each set runs with uniform weights and with weights fitted on a grid. Weight fitting uses only the first contiguous half of each seen test split, in sorted path order, and holds out the second half. The split is contiguous rather than interleaved because CVC-ClinicDB frames come from video sequences, and an interleaved split would put near-duplicate frames on both sides. The unseen splits stay untouched as the primary endpoint. The decision threshold stays at 0.5, since a fitted threshold would be a second confound. Ensembles and the cascade report in a third tier, </w:t>
+      </w:r>
+      <w:r>
+        <w:rPr>
+          <w:rFonts w:ascii="Consolas" w:hAnsi="Consolas"/>
+        </w:rPr>
+        <w:t>derived</w:t>
+      </w:r>
+      <w:r>
+        <w:t>, separate from both the trained models and the oracle baselines: they are fair, because they read no ground truth at inference, but they are not peers of a single architecture in a table that asks which backbone generalizes better.</w:t>
+      </w:r>
+    </w:p>
+    <w:p>
+      <w:r>
+        <w:t xml:space="preserve">The expected ranges are written down before the run, so a bug is visible. A uniform ensemble should land between 0.77 and 0.83 unseen mDice; a value below 0.75 signals a defect, and a value below SAM-ViT-H's 0.806 is not a defect, because U-Net saturates its sigmoid harder than the LoRA models and can pull a uniform average toward itself. Fitted weights should move the uniform result by −0.005 to +0.015. The members share training data and loss, so their errors correlate, and I expect a gain of about 0.01 to 0.03 over the best single model rather than a large one. The cascade should land between 0.75 and 0.88: MedSAM with a correct box scores about 0.92, so a detector that produces a usable box on a fraction </w:t>
+      </w:r>
+      <w:r>
+        <w:rPr>
+          <w:i/>
+        </w:rPr>
+        <w:t>f</w:t>
+      </w:r>
+      <w:r>
+        <w:t xml:space="preserve"> of images gives roughly 0.92 </w:t>
+      </w:r>
+      <w:r>
+        <w:rPr>
+          <w:i/>
+        </w:rPr>
+        <w:t>f</w:t>
+      </w:r>
+      <w:r>
+        <w:t>. Detection caps the cascade, and that cap is the number I most want to measure. Cost is small on the compute side, about one to one and a half A100-hours to cache the per-image probability maps for nine runs; the rest runs on a CPU from the cache. The cache, combination, and cascade code with its GPU-free tests already exists on a feature branch and is waiting on the GPU pass.</w:t>
+      </w:r>
+    </w:p>
+    <w:p>
+      <w:r>
+        <w:rPr>
+          <w:i/>
+        </w:rPr>
+        <w:t>2. A second benchmark family.</w:t>
+      </w:r>
+      <w:r>
+        <w:t xml:space="preserve"> Evaluate outside PraNet's five datasets, since that is the limitation that bounds the claim most.</w:t>
+      </w:r>
+    </w:p>
+    <w:p>
+      <w:r>
+        <w:rPr>
+          <w:i/>
+        </w:rPr>
+        <w:t>3. Color sensitivity.</w:t>
+      </w:r>
+      <w:r>
+        <w:t xml:space="preserve"> Probe it with the grayscale-replication experiment already designed in </w:t>
+      </w:r>
+      <w:r>
+        <w:rPr>
+          <w:rFonts w:ascii="Consolas" w:hAnsi="Consolas"/>
+        </w:rPr>
+        <w:t>docs/MEDSAM_INVESTIGATION.md</w:t>
+      </w:r>
+      <w:r>
+        <w:t>.</w:t>
+      </w:r>
+    </w:p>
+    <w:p>
+      <w:r>
+        <w:rPr>
+          <w:i/>
+        </w:rPr>
+        <w:t>4. Adapter capacity.</w:t>
+      </w:r>
+      <w:r>
+        <w:t xml:space="preserve"> Test larger LoRA ranks and separate Q and V targets, which would also close the remaining difference from the SAMed recipe.</w:t>
       </w:r>
     </w:p>
     <w:p>

</xml_diff>

<commit_message>
Proposed final: fact-check, citation, and overclaim pass on the project report
Soften SAM-ViT-B vs U-Net (inside seed spread), remove mechanism claims
from Section 7, count three model families, cite the PraNet data release
and MedSAM inference script for split sizes and the min-max contract, add
references for wF-beta, AdamW, smp, and Albumentations, fix page numbers
for [4] and [13], and correct the ensemble cache cost.
</commit_message>
<xml_diff>
--- a/docs/PROJECT_REPORT.docx
+++ b/docs/PROJECT_REPORT.docx
@@ -92,7 +92,7 @@
         <w:t>A measured diagnosis of MedSAM's deficit.</w:t>
       </w:r>
       <w:r>
-        <w:t xml:space="preserve"> MedSAM's apparent collapse (0.661 unseen) bundled three causes. A controlled three-arm experiment separated them: a preprocessing bug in my pipeline cost 0.069 Dice; with backbone and preprocessing matched, the MedSAM checkpoint still trails generic SAM by 0.036, comparable in size to the 0.045 cost of the smaller backbone. My first reading was that medical pretraining is a net drag. I retracted that after the controlled runs.</w:t>
+        <w:t xml:space="preserve"> MedSAM + LoRA landed last (0.661 unseen). A controlled three-arm experiment split its 0.100 deficit against SAM-ViT-B: a preprocessing bug in my pipeline cost 0.069 Dice; with backbone and preprocessing matched, the MedSAM checkpoint still trails generic SAM by 0.036. A separate 0.045 backbone-size effect, measured on generic SAM, is comparable to that residual. My first reading was that medical pretraining is a net drag. I retracted that after the controlled runs.</w:t>
       </w:r>
     </w:p>
     <w:p>
@@ -106,12 +106,12 @@
         <w:t>Prompt dependence quantified.</w:t>
       </w:r>
       <w:r>
-        <w:t xml:space="preserve"> With its two contracts honored (a box prompt and min-max inputs), untrained MedSAM posts the best unseen number in the study (0.925). A ground-truth box lifts SAM-ViT-H by +0.099 but lifts corrected MedSAM by +0.200. MedSAM is a specialized model, and the pattern is consistent with an encoder that relies on the box for localization and pays when the box is taken away.</w:t>
+        <w:t xml:space="preserve"> With its two contracts honored (a box prompt and min-max inputs), untrained MedSAM posts the highest number in the oracle tier (0.925 unseen), an upper bound rather than a peer of the trained rows. A ground-truth box lifts SAM-ViT-H by +0.099 but lifts corrected MedSAM by +0.200. MedSAM is a specialized model, and the pattern is consistent with an encoder that relies on the box for localization and pays when the box is taken away.</w:t>
       </w:r>
     </w:p>
     <w:p>
       <w:r>
-        <w:t>The contributions are a controlled comparison of four model families under one protocol, two matched pairings that separate the pretraining source from the backbone size, a measured preprocessing effect, a documented root-cause investigation of a preprocessing confound, and a reproducible config-driven pipeline with all results consolidated in one summary.</w:t>
+        <w:t>The contributions are a controlled comparison of three model families (six trained variants) under one protocol, two matched pairings that separate the pretraining source from the backbone size, a measured preprocessing effect, a documented root-cause investigation of a preprocessing confound, and a reproducible config-driven pipeline with all results consolidated in one summary.</w:t>
       </w:r>
     </w:p>
     <w:p>
@@ -130,7 +130,7 @@
         <w:t>Specialist polyp segmentation networks.</w:t>
       </w:r>
       <w:r>
-        <w:t xml:space="preserve"> U-Net [1] established the encoder-decoder architecture with skip connections that dominates medical image segmentation. PraNet [2] defined the evaluation protocol this study adopts: train on 1,450 images from Kvasir-SEG and CVC-ClinicDB, test on held-out portions of the same two datasets (seen) and on three datasets the model never saw (CVC-ColonDB, ETIS-LaribPolypDB, CVC-300). PraNet reported that specialist CNNs lose a lot of accuracy on the unseen splits, which made cross-dataset generalization a standard metric for this task. Polyp-PVT [3] pushed specialist accuracy further with a pyramid vision transformer backbone. Both are strong on the benchmark; both are trained end-to-end on a few thousand polyp images, which bounds how much visual diversity they can absorb.</w:t>
+        <w:t xml:space="preserve"> U-Net [1] established the encoder-decoder architecture with skip connections that dominates medical image segmentation. PraNet [2] defined the evaluation protocol this study adopts: train on 1,450 images from Kvasir-SEG and CVC-ClinicDB, test on held-out portions of the same two datasets (seen) and on three datasets the model never saw (CVC-ColonDB, ETIS-LaribPolypDB, CVC-300). The split sizes come from the PraNet data release [15]; the paper itself describes an 80/10/10 split. PraNet's tables show its specialist baselines lose accuracy on the unseen splits (U-Net falls from 0.818 on Kvasir to 0.512 on ColonDB), which made cross-dataset generalization a standard metric for this task. Polyp-PVT [3] pushed specialist accuracy further with a pyramid vision transformer backbone. Both are strong on the benchmark; both are trained end-to-end on a few thousand polyp images, which bounds how much visual diversity they can absorb.</w:t>
       </w:r>
     </w:p>
     <w:p>
@@ -141,7 +141,7 @@
         <w:t>Segmentation foundation models.</w:t>
       </w:r>
       <w:r>
-        <w:t xml:space="preserve"> SAM [4] trained a ViT image encoder and a promptable mask decoder on SA-1B, a corpus of 11M images and 1.1B masks. Zero-shot SAM segments natural images well but underperforms on medical imagery, where object boundaries follow tissue contrast rather than natural-image edges. MedSAM [5] fine-tuned SAM ViT-B on about 1.57M medical image-mask pairs across ten modalities and reported accuracy above per-modality specialist U-Net and DeepLabV3+ baselines, endoscopy included [5], with one structural condition: every training step supplied a bounding-box prompt. The model was never asked to localize an object on its own.</w:t>
+        <w:t xml:space="preserve"> SAM [4] trained a ViT image encoder and a promptable mask decoder on SA-1B, a corpus of 11M images and 1.1B masks. Zero-shot SAM segments natural images well but underperforms on medical imagery, where object boundaries follow tissue contrast rather than natural-image edges. MedSAM [5] fine-tuned SAM ViT-B on about 1.57M medical image-mask pairs across ten modalities and reported that it "ranked in first place on most tasks, surpassing the performance of the U-Net and DeepLabV3+ specialist models" [5], endoscopy among them, with one structural condition: every training step supplied a bounding-box prompt, and the specialist baselines in that comparison received the box as well. The model was never asked to localize an object on its own.</w:t>
       </w:r>
     </w:p>
     <w:p>
@@ -152,7 +152,7 @@
         <w:t>Parameter-efficient fine-tuning.</w:t>
       </w:r>
       <w:r>
-        <w:t xml:space="preserve"> LoRA [6] freezes a pretrained weight matrix and learns a low-rank update, which cuts trainable parameters by orders of magnitude while it keeps the pretrained representation intact. SAMed [7] applied LoRA to a frozen SAM encoder for medical segmentation and is the method this project adapts: LoRA on the attention projections, a no prompts at inference. SAMed keeps and fine-tunes SAM's own mask decoder; this project replaces that decoder with a small CNN decoder, which is the one departure from the SAMed recipe.</w:t>
+        <w:t xml:space="preserve"> LoRA [6] freezes a pretrained weight matrix and learns a low-rank update, which cuts trainable parameters by orders of magnitude while it keeps the pretrained representation intact. SAMed [7] applied LoRA to a frozen SAM encoder for medical segmentation and is the method this project adapts: LoRA on the attention projections, no prompts at inference. SAMed keeps and fine-tunes SAM's own mask decoder; this project replaces that decoder with a small CNN decoder, which is the one departure from the SAMed recipe.</w:t>
       </w:r>
     </w:p>
     <w:p>
@@ -160,7 +160,7 @@
         <w:rPr>
           <w:b/>
         </w:rPr>
-        <w:t>The unanswered question.</w:t>
+        <w:t>The question I did not find answered.</w:t>
       </w:r>
       <w:r>
         <w:t xml:space="preserve"> The surveyed work reports benchmark accuracy. None of it says whether LoRA adaptation of a foundation model buys </w:t>
@@ -172,7 +172,7 @@
         <w:t>generalization</w:t>
       </w:r>
       <w:r>
-        <w:t>, measured on the same seen/unseen protocol the specialists were built on, under one training protocol, with the cost of each option recorded. Two published claims also sit in tension: MedSAM reports beating its specialist baselines on endoscopy, and the PraNet protocol is exactly the setting where that claim can be tested without a prompt oracle. I did not find a published run of that test. This study runs it.</w:t>
+        <w:t>, measured on the same seen/unseen protocol the specialists were built on, under one training protocol, with the cost of each option recorded. Two published claims also sit in tension: MedSAM reports beating box-prompted specialist baselines on endoscopy, and the PraNet protocol is exactly the setting where that claim can be tested without a prompt oracle on either side. I did not find a published run of that test. This study runs it.</w:t>
       </w:r>
     </w:p>
     <w:p>
@@ -306,7 +306,7 @@
         <w:t>Significance.</w:t>
       </w:r>
       <w:r>
-        <w:t xml:space="preserve"> If a frozen foundation backbone plus a sub-1M-parameter adapter generalizes better than a specialist, then sites with modest data and compute can prefer adapters over from-scratch training. The MedSAM analysis also shows how a preprocessing contract violation can look like a scientific finding. That is a methods lesson that reaches past this task.</w:t>
+        <w:t xml:space="preserve"> If a frozen foundation backbone plus a sub-1M-parameter adapter generalizes better than a specialist, then a site with modest data and compute has a measured reason to test adapters against end-to-end training of a pretrained specialist on its own data. The MedSAM analysis also shows how a preprocessing contract violation can look like a scientific finding. That lesson applies to any pipeline that mixes checkpoints with different input contracts.</w:t>
       </w:r>
     </w:p>
     <w:p>
@@ -327,7 +327,7 @@
     </w:p>
     <w:p>
       <w:r>
-        <w:t xml:space="preserve">The study follows the PraNet five-split protocol: the same five datasets and the same split sizes, as configured in </w:t>
+        <w:t xml:space="preserve">The study follows the PraNet five-split protocol: the same five datasets and the same split sizes as the PraNet data release [15], as configured in </w:t>
       </w:r>
       <w:r>
         <w:rPr>
@@ -398,7 +398,7 @@
           </w:tcPr>
           <w:p>
             <w:r>
-              <w:t>Kvasir-SEG</w:t>
+              <w:t>Kvasir-SEG [8]</w:t>
             </w:r>
           </w:p>
         </w:tc>
@@ -430,7 +430,7 @@
           </w:tcPr>
           <w:p>
             <w:r>
-              <w:t>CVC-ClinicDB</w:t>
+              <w:t>CVC-ClinicDB [9]</w:t>
             </w:r>
           </w:p>
         </w:tc>
@@ -462,7 +462,7 @@
           </w:tcPr>
           <w:p>
             <w:r>
-              <w:t>CVC-ColonDB</w:t>
+              <w:t>CVC-ColonDB [10]</w:t>
             </w:r>
           </w:p>
         </w:tc>
@@ -494,7 +494,7 @@
           </w:tcPr>
           <w:p>
             <w:r>
-              <w:t>ETIS-LaribPolypDB</w:t>
+              <w:t>ETIS-LaribPolypDB [11]</w:t>
             </w:r>
           </w:p>
         </w:tc>
@@ -526,7 +526,7 @@
           </w:tcPr>
           <w:p>
             <w:r>
-              <w:t>CVC-300 (EndoScene)</w:t>
+              <w:t>CVC-300 (EndoScene) [12]</w:t>
             </w:r>
           </w:p>
         </w:tc>
@@ -555,7 +555,7 @@
     <w:p/>
     <w:p>
       <w:r>
-        <w:t>Training uses 1,450 images. The two seen test splits measure learning ability; the three unseen splits measure generalization. The primary derived metric is the gap: mean seen mDice minus mean unseen mDice.</w:t>
+        <w:t>Training uses 1,450 images. The two seen test splits measure learning ability; the three unseen splits measure generalization. The primary derived metric is the seen-to-unseen drop: mean seen mDice minus mean unseen mDice (the Gap column in the tables).</w:t>
       </w:r>
     </w:p>
     <w:p>
@@ -901,7 +901,7 @@
     </w:p>
     <w:p>
       <w:r>
-        <w:t xml:space="preserve">All trained models share one protocol: 352×352 inputs, batch size 4, AdamW (learning rate 5e-5, weight decay 1e-4), cosine schedule, combined Dice + BCE loss, up to 50 epochs with early stopping at patience 8, checkpoint selection by best validation Dice, three seeds (42, 43, 44), one NVIDIA A100-SXM4-40GB. Augmentation: flips, rotation, and color jitter via Albumentations. Input normalization is bound to the model key: ImageNet standardization for SAM and U-Net (the same mean and std that SAM's native </w:t>
+        <w:t xml:space="preserve">All trained models share one protocol: 352×352 inputs, batch size 4, AdamW [18] (learning rate 5e-5, weight decay 1e-4), cosine schedule, combined Dice + BCE loss, up to 50 epochs with early stopping at patience 8, checkpoint selection by best validation Dice, three seeds (42, 43, 44), one NVIDIA A100-SXM4-40GB. Augmentation: flips, rotation, and color jitter via Albumentations [20]. Input normalization is bound to the model key: ImageNet standardization for SAM and U-Net (the same mean and std that SAM's native </w:t>
       </w:r>
       <w:r>
         <w:rPr>
@@ -910,7 +910,7 @@
         <w:t>preprocess</w:t>
       </w:r>
       <w:r>
-        <w:t xml:space="preserve"> applies), per-image min-max [0,1] for the corrected MedSAM arms (MedSAM's native contract).</w:t>
+        <w:t xml:space="preserve"> applies), per-image min-max [0,1] for the corrected MedSAM arms (the contract in MedSAM's released inference script [16]).</w:t>
       </w:r>
     </w:p>
     <w:p>
@@ -923,7 +923,7 @@
     </w:p>
     <w:p>
       <w:r>
-        <w:t xml:space="preserve">All five splits are scored with the PraNet metric suite: mDice and mIoU (primary), weighted F-beta, S-measure, E-measure, and MAE. Reported numbers are means with standard deviation over the three seeds. Cost metrics (trainable parameters, checkpoint size, wall-clock training time, device name) are recorded in each run's </w:t>
+        <w:t xml:space="preserve">All five splits are scored with the PraNet metric suite: mDice and mIoU (primary), weighted F-beta [17], S-measure [13], E-measure [14], and MAE. Reported numbers are means with standard deviation over the three seeds. Cost metrics (trainable parameters, checkpoint size, wall-clock training time, device name) are recorded in each run's </w:t>
       </w:r>
       <w:r>
         <w:rPr>
@@ -1313,7 +1313,7 @@
         <w:t>src/models/</w:t>
       </w:r>
       <w:r>
-        <w:t xml:space="preserve"> (U-Net via segmentation-models-pytorch; </w:t>
+        <w:t xml:space="preserve"> (U-Net via segmentation-models-pytorch [19]; </w:t>
       </w:r>
       <w:r>
         <w:rPr>
@@ -2045,7 +2045,7 @@
         <w:t>RQ2 (unseen).</w:t>
       </w:r>
       <w:r>
-        <w:t xml:space="preserve"> SAM-ViT-H + LoRA leads every unseen split and holds 0.806 mean unseen Dice against U-Net's 0.755. Its seen-to-unseen drop is 0.082, about half of U-Net's 0.145. Even SAM-ViT-B + LoRA (0.761 unseen) edges past U-Net while it trains 1.3% of U-Net's parameters. The separation is widest on ETIS-LaribPolypDB, the hardest unseen split: SAM-ViT-H 0.745, SAM-ViT-B 0.692, U-Net 0.690.</w:t>
+        <w:t xml:space="preserve"> SAM-ViT-H + LoRA leads every unseen split and holds 0.806 mean unseen Dice against U-Net's 0.755. Its seen-to-unseen drop is 0.082, about half of U-Net's 0.145. SAM-ViT-B + LoRA (0.761 unseen) lands level with U-Net (0.755) on the unseen mean, inside the seed spread (U-Net's seed 44 reaches 0.774), while it trains 1.3% of U-Net's parameters; its smaller drop (0.104 against 0.145) is the separated number. The separation is widest on ETIS-LaribPolypDB, the hardest unseen split: SAM-ViT-H 0.745, SAM-ViT-B 0.692, U-Net 0.690.</w:t>
       </w:r>
     </w:p>
     <w:p>
@@ -2056,7 +2056,7 @@
         <w:t>RQ3 (cost).</w:t>
       </w:r>
       <w:r>
-        <w:t xml:space="preserve"> U-Net trains fastest (10 min) with the smallest checkpoint (98 MB). SAM-ViT-H + LoRA costs 120 min and a 2.5 GB checkpoint, dominated by the frozen backbone. SAM-ViT-B + LoRA is the efficiency pick: 29 min, 349 MB, and it still generalizes better than U-Net. Accuracy per trainable parameter favors the adapters; accuracy per minute favors U-Net. Which one matters depends on whether the target is the benchmark or the next clinic. The whole study (18 trained runs) took about 750 GPU-minutes, or 12.5 A100-hours. At Colab rates that is roughly 15 dollars of compute. The GPU-hours are measured; the dollar figure is an estimate from the published rate.</w:t>
+        <w:t xml:space="preserve"> U-Net trains fastest (10 min) with the smallest checkpoint (98 MB). SAM-ViT-H + LoRA costs 120 min and a 2.5 GB checkpoint, dominated by the frozen backbone. SAM-ViT-B + LoRA is the efficiency pick: 29 min, 349 MB, and a smaller seen-to-unseen drop than U-Net. Accuracy per trainable parameter favors the adapters; accuracy per minute favors U-Net. Which one matters depends on whether the target is the seen benchmark or the unseen splits. The whole study (18 trained runs) took about 750 GPU-minutes, or 12.5 A100-hours. At Colab rates that is roughly 15 dollars of compute. The GPU-hours are measured; the dollar figure is an estimate from the published rate.</w:t>
       </w:r>
     </w:p>
     <w:p>
@@ -2537,7 +2537,7 @@
     <w:p/>
     <w:p>
       <w:r>
-        <w:t>The models sit close together on the seen splits and spread apart on the unseen ones. They separate on generalization. Learning ability is roughly a tie.</w:t>
+        <w:t>The top three models sit within 0.035 of each other on the seen splits and spread by 0.051 on the unseen ones; the MedSAM arms trail on both.</w:t>
       </w:r>
     </w:p>
     <w:p>
@@ -3049,7 +3049,7 @@
         <w:t>The adaptation trade is real and favorable off-distribution, on this benchmark family.</w:t>
       </w:r>
       <w:r>
-        <w:t xml:space="preserve"> The frozen SAM backbone carries visual priors beyond what an ImageNet-initialized CNN picks up from 1,450 polyp images, and the result is consistent with rank-4 LoRA being enough to point those priors at the task. The result pattern (specialist wins at home, adapter wins away) matches the deployment question clinics actually face, and the gap metric puts the trade in one line: 3% of the trainable parameters comes with half the generalization drop.</w:t>
+        <w:t xml:space="preserve"> The result is consistent with the frozen SAM backbone holding visual priors that an ImageNet-initialized ResNet-34 does not pick up from 1,450 polyp images, and with rank-4 LoRA being enough to point them at the task; backbone scale and architecture are not separated here. The result pattern (specialist wins at home, adapter wins away) matches the shape of the cross-dataset question on the one benchmark family I measured, and the drop metric puts the trade in one line: 3% of the trainable parameters comes with about half the generalization drop.</w:t>
       </w:r>
     </w:p>
     <w:p>
@@ -3060,7 +3060,7 @@
         <w:t>MedSAM is specialized, not weak.</w:t>
       </w:r>
       <w:r>
-        <w:t xml:space="preserve"> The finding I learned the most from is negative in form. MedSAM's published claim (above its specialist baselines on endoscopy) and my measured result (last on every split) are both correct. They measure different contracts. MedSAM with a box and min-max inputs posts the best unseen number here (0.925). MedSAM without the box loses the most, because its fine-tuning let the encoder offload localization to the prompt. A practitioner choosing a model should ask which contract the deployment honors. If no localizer supplies a box at inference, I would pick prompt-free adaptation of generic SAM over medical-pretrained MedSAM at the same size; the 0.036 residual in Section 6.3 is the reason, with the caveat that it rests on one benchmark family and three seeds.</w:t>
+        <w:t xml:space="preserve"> The finding I learned the most from is negative in form. MedSAM's published claim (above its specialist baselines on endoscopy) and my measured result (last among the prompt-free models at the time) are both correct. They measure different contracts. MedSAM with a box and min-max inputs posts the highest unseen number in the oracle tier (0.925). MedSAM without the box loses the most (+0.200 from the oracle box), and that size is consistent with an encoder that learned to rely on the prompt for localization; I measured the lift, not the mechanism. A practitioner choosing a model should ask which contract the deployment honors. If no localizer supplies a box at inference, I would pick prompt-free adaptation of generic SAM over medical-pretrained MedSAM at the same size; the 0.036 residual in Section 6.3 is the reason, with the caveat that it rests on one benchmark family and three seeds.</w:t>
       </w:r>
     </w:p>
     <w:p>
@@ -3095,7 +3095,7 @@
     </w:p>
     <w:p>
       <w:r>
-        <w:t>A frozen SAM ViT-H backbone with an 830K-parameter LoRA adapter scores higher than a 24.4M-parameter ImageNet-initialized U-Net on the three unseen PraNet datasets (0.806 vs 0.755 mean Dice, three seeds, no significance test) and halves the seen-to-unseen drop (0.082 vs 0.145), while the specialist keeps the edge on seen data and in training cost. Controlled ablations attribute MedSAM's apparent collapse to three measured causes: a 0.069 preprocessing artifact in my own pipeline, a 0.036 residual for the MedSAM checkpoint at matched size, and a 0.045 backbone-size effect, the last two comparable in size, and quantify its prompt dependence (+0.200 from an oracle box against +0.099 for generic SAM).</w:t>
+        <w:t>A frozen SAM ViT-H backbone with an 830K-parameter LoRA adapter scores higher than a 24.4M-parameter ImageNet-initialized U-Net on the three unseen PraNet datasets (0.806 vs 0.755 mean Dice, three seeds, no significance test) and cuts the seen-to-unseen drop to about half (0.082 vs 0.145), while the specialist keeps the edge on seen data and in training cost. Controlled ablations split MedSAM's 0.100 unseen deficit against SAM-ViT-B into a 0.069 preprocessing artifact in my own pipeline and a 0.036 residual for the checkpoint at matched size; a separate 0.045 backbone-size effect, measured on generic SAM, is comparable to that residual. The oracle runs quantify prompt dependence (+0.200 from a ground-truth box for corrected MedSAM against +0.099 for generic SAM).</w:t>
       </w:r>
     </w:p>
     <w:p>
@@ -3106,7 +3106,7 @@
         <w:t>Contributions.</w:t>
       </w:r>
       <w:r>
-        <w:t xml:space="preserve"> (1) A controlled four-family comparison (specialist CNN, LoRA-adapted generic SAM at two sizes, LoRA-adapted MedSAM) under one protocol, three seeds, one GPU, with full cost accounting. (2) Two controlled pairings that separate the pretraining source from the backbone size, plus a measured preprocessing effect, via matched arms. (3) A documented root-cause investigation and retraction pattern for a preprocessing confound. (4) A reproducible pipeline: config-driven trainer, GPU-free tests, mechanical results aggregation.</w:t>
+        <w:t xml:space="preserve"> (1) A controlled comparison of three model families (specialist CNN, LoRA-adapted generic SAM at two sizes, LoRA-adapted MedSAM), six trained variants, under one protocol, three seeds, one GPU, with full cost accounting. (2) Two controlled pairings that separate the pretraining source from the backbone size, plus a measured preprocessing effect, via matched arms. (3) A documented root-cause investigation and retraction pattern for a preprocessing confound. (4) A reproducible pipeline: config-driven trainer, GPU-free tests, mechanical results aggregation.</w:t>
       </w:r>
     </w:p>
     <w:p>
@@ -3139,7 +3139,7 @@
         <w:t>1. An ensemble decision system.</w:t>
       </w:r>
       <w:r>
-        <w:t xml:space="preserve"> The six trained models make different errors, and the per-split table in Section 6.2 shows where: U-Net wins ClinicDB, SAM-ViT-H wins every unseen split, and MedSAM with a box beats both. The next experiment combines them at inference without reading any ground truth. It has two parts. A </w:t>
+        <w:t xml:space="preserve"> The per-split table in Section 6.2 shows different winners on different splits (U-Net on ClinicDB, SAM-ViT-H on every unseen split, and box-prompted MedSAM above both in the oracle tier), which suggests the models make some different errors; the ensemble run will measure how much. The next experiment combines them at inference without reading any ground truth. It has two parts. A </w:t>
       </w:r>
       <w:r>
         <w:rPr>
@@ -3162,7 +3162,7 @@
     </w:p>
     <w:p>
       <w:r>
-        <w:t xml:space="preserve">The design is pre-registered in </w:t>
+        <w:t xml:space="preserve">I wrote the design down before the run in </w:t>
       </w:r>
       <w:r>
         <w:rPr>
@@ -3171,7 +3171,7 @@
         <w:t>docs/PLAN_ENSEMBLE.md</w:t>
       </w:r>
       <w:r>
-        <w:t xml:space="preserve"> so that the result cannot be tuned after the fact. Two member sets are fixed in advance: set A is U-Net plus SAM-ViT-H, the largest architectural distance in the study; set B is the top three prompt-free rows (SAM-ViT-H, SAM-ViT-B, U-Net). Each set runs with uniform weights and with weights fitted on a grid. Weight fitting uses only the first contiguous half of each seen test split, in sorted path order, and holds out the second half. The split is contiguous rather than interleaved because CVC-ClinicDB frames come from video sequences, and an interleaved split would put near-duplicate frames on both sides. The unseen splits stay untouched as the primary endpoint. The decision threshold stays at 0.5, since a fitted threshold would be a second confound. Ensembles and the cascade report in a third tier, </w:t>
+        <w:t xml:space="preserve"> (on the ensemble branch), with fixed member sets and expected ranges, so any change after the result is visible in the file history. Two member sets are fixed in advance: set A is U-Net plus SAM-ViT-H, the largest architectural distance in the study; set B is the top three prompt-free rows (SAM-ViT-H, SAM-ViT-B, U-Net). Each set runs with uniform weights and with weights fitted on a grid. Weight fitting uses only the first contiguous half of each seen test split, in sorted path order, and holds out the second half. The split is contiguous rather than interleaved because CVC-ClinicDB frames come from video sequences, and an interleaved split would put near-duplicate frames on both sides. The unseen splits stay untouched as the primary endpoint. The decision threshold stays at 0.5, since a fitted threshold would be a second confound. Ensembles and the cascade report in a third tier, </w:t>
       </w:r>
       <w:r>
         <w:rPr>
@@ -3185,7 +3185,7 @@
     </w:p>
     <w:p>
       <w:r>
-        <w:t xml:space="preserve">The expected ranges are written down before the run, so a bug is visible. A uniform ensemble should land between 0.77 and 0.83 unseen mDice; a value below 0.75 signals a defect, and a value below SAM-ViT-H's 0.806 is not a defect, because U-Net saturates its sigmoid harder than the LoRA models and can pull a uniform average toward itself. Fitted weights should move the uniform result by −0.005 to +0.015. The members share training data and loss, so their errors correlate, and I expect a gain of about 0.01 to 0.03 over the best single model rather than a large one. The cascade should land between 0.75 and 0.88: MedSAM with a correct box scores about 0.92, so a detector that produces a usable box on a fraction </w:t>
+        <w:t xml:space="preserve">The expected ranges are written down before the run, so a bug is visible. A uniform ensemble should land between 0.77 and 0.83 unseen mDice; a value below 0.75 signals a defect, and a value below SAM-ViT-H's 0.806 should not count as a defect on its own, because I expect U-Net to saturate its sigmoid harder than the LoRA models and pull a uniform average toward itself, which a planned calibration diagnostic will check. Fitted weights should move the uniform result by −0.005 to +0.015. The members share training data and loss, so their errors correlate, and I expect a gain of about 0.01 to 0.03 over the best single model rather than a large one. The cascade should land between 0.75 and 0.88: MedSAM with a correct box scores about 0.92, so a detector that produces a usable box on a fraction </w:t>
       </w:r>
       <w:r>
         <w:rPr>
@@ -3203,7 +3203,7 @@
         <w:t>f</w:t>
       </w:r>
       <w:r>
-        <w:t>. Detection caps the cascade, and that cap is the number I most want to measure. Cost is small on the compute side, about one to one and a half A100-hours to cache the per-image probability maps for nine runs; the rest runs on a CPU from the cache. The cache, combination, and cascade code with its GPU-free tests already exists on a feature branch and is waiting on the GPU pass.</w:t>
+        <w:t>. Detection caps the cascade, and that cap is the number I most want to measure. Cost is small on the compute side: about one A100-hour for the whole experiment, most of it a 45 to 75 minute Colab session to cache the probability maps for nine runs (the caching compute itself is about 16 minutes), and the rest runs on a CPU from the cache. The cache, combination, and cascade code with its GPU-free tests already exists on a feature branch and is waiting on the GPU pass.</w:t>
       </w:r>
     </w:p>
     <w:p>
@@ -3295,7 +3295,7 @@
         <w:t>CAAI Artificial Intelligence Research</w:t>
       </w:r>
       <w:r>
-        <w:t>, vol. 2, 2023.</w:t>
+        <w:t>, vol. 2, Art. no. 9150015, 2023.</w:t>
       </w:r>
     </w:p>
     <w:p>
@@ -3309,7 +3309,7 @@
         <w:t>Proc. IEEE/CVF ICCV</w:t>
       </w:r>
       <w:r>
-        <w:t>, 2023, pp. 4015–4026.</w:t>
+        <w:t>, 2023, pp. 3992–4003.</w:t>
       </w:r>
     </w:p>
     <w:p>
@@ -3323,7 +3323,7 @@
         <w:t>Nature Communications</w:t>
       </w:r>
       <w:r>
-        <w:t>, vol. 15, no. 654, 2024.</w:t>
+        <w:t>, vol. 15, Art. no. 654, 2024.</w:t>
       </w:r>
     </w:p>
     <w:p>
@@ -3361,7 +3361,7 @@
     </w:p>
     <w:p>
       <w:r>
-        <w:t xml:space="preserve">[9] J. Bernal, F. J. Sánchez, G. Fernández-Esparrach, D. Gil, C. Rodríguez, and F. Vilariño, "WM-DOVA maps for accurate polyp highlighting in colonoscopy," </w:t>
+        <w:t xml:space="preserve">[9] J. Bernal, F. J. Sánchez, G. Fernández-Esparrach, D. Gil, C. Rodríguez de Miguel, and F. Vilariño, "WM-DOVA maps for accurate polyp highlighting in colonoscopy: Validation vs. saliency maps from physicians," </w:t>
       </w:r>
       <w:r>
         <w:rPr>
@@ -3412,7 +3412,7 @@
         <w:t>Journal of Healthcare Engineering</w:t>
       </w:r>
       <w:r>
-        <w:t>, vol. 2017. (CVC-300 / EndoScene)</w:t>
+        <w:t>, vol. 2017, Art. no. 4037190, 2017. (CVC-300 / EndoScene)</w:t>
       </w:r>
     </w:p>
     <w:p>
@@ -3426,7 +3426,7 @@
         <w:t>Proc. IEEE ICCV</w:t>
       </w:r>
       <w:r>
-        <w:t>, 2017, pp. 4548–4557.</w:t>
+        <w:t>, 2017, pp. 4558–4567.</w:t>
       </w:r>
     </w:p>
     <w:p>
@@ -3441,6 +3441,72 @@
       </w:r>
       <w:r>
         <w:t>, 2018, pp. 698–704.</w:t>
+      </w:r>
+    </w:p>
+    <w:p>
+      <w:r>
+        <w:t>[15] D.-P. Fan et al., "PraNet," GitHub repository, 2020. https://github.com/DengPingFan/PraNet (training and test split release: 900 Kvasir-SEG and 550 CVC-ClinicDB training images; test splits of 100, 62, 380, 196, and 60 images).</w:t>
+      </w:r>
+    </w:p>
+    <w:p>
+      <w:r>
+        <w:t>[16] J. Ma et al., "MedSAM," GitHub repository, 2024. https://github.com/bowang-lab/MedSAM (</w:t>
+      </w:r>
+      <w:r>
+        <w:rPr>
+          <w:rFonts w:ascii="Consolas" w:hAnsi="Consolas"/>
+        </w:rPr>
+        <w:t>MedSAM_Inference.py</w:t>
+      </w:r>
+      <w:r>
+        <w:t>: per-image min-max normalization to [0,1]).</w:t>
+      </w:r>
+    </w:p>
+    <w:p>
+      <w:r>
+        <w:t xml:space="preserve">[17] R. Margolin, L. Zelnik-Manor, and A. Tal, "How to evaluate foreground maps?" in </w:t>
+      </w:r>
+      <w:r>
+        <w:rPr>
+          <w:i/>
+        </w:rPr>
+        <w:t>Proc. IEEE CVPR</w:t>
+      </w:r>
+      <w:r>
+        <w:t>, 2014, pp. 248–255.</w:t>
+      </w:r>
+    </w:p>
+    <w:p>
+      <w:r>
+        <w:t xml:space="preserve">[18] I. Loshchilov and F. Hutter, "Decoupled weight decay regularization," in </w:t>
+      </w:r>
+      <w:r>
+        <w:rPr>
+          <w:i/>
+        </w:rPr>
+        <w:t>Proc. ICLR</w:t>
+      </w:r>
+      <w:r>
+        <w:t>, 2019.</w:t>
+      </w:r>
+    </w:p>
+    <w:p>
+      <w:r>
+        <w:t>[19] P. Iakubovskii, "Segmentation Models Pytorch," GitHub repository, 2019. https://github.com/qubvel/segmentation_models.pytorch</w:t>
+      </w:r>
+    </w:p>
+    <w:p>
+      <w:r>
+        <w:t xml:space="preserve">[20] A. Buslaev, V. I. Iglovikov, E. Khvedchenya, A. Parinov, M. Druzhinin, and A. A. Kalinin, "Albumentations: Fast and flexible image augmentations," </w:t>
+      </w:r>
+      <w:r>
+        <w:rPr>
+          <w:i/>
+        </w:rPr>
+        <w:t>Information</w:t>
+      </w:r>
+      <w:r>
+        <w:t>, vol. 11, no. 2, Art. no. 125, 2020.</w:t>
       </w:r>
     </w:p>
     <w:p>

</xml_diff>

<commit_message>
Use the CVF page numbering for references 4 and 13, as PraNet does
</commit_message>
<xml_diff>
--- a/docs/PROJECT_REPORT.docx
+++ b/docs/PROJECT_REPORT.docx
@@ -3309,7 +3309,7 @@
         <w:t>Proc. IEEE/CVF ICCV</w:t>
       </w:r>
       <w:r>
-        <w:t>, 2023, pp. 3992–4003.</w:t>
+        <w:t>, 2023, pp. 4015–4026.</w:t>
       </w:r>
     </w:p>
     <w:p>
@@ -3426,7 +3426,7 @@
         <w:t>Proc. IEEE ICCV</w:t>
       </w:r>
       <w:r>
-        <w:t>, 2017, pp. 4558–4567.</w:t>
+        <w:t>, 2017, pp. 4548–4557.</w:t>
       </w:r>
     </w:p>
     <w:p>

</xml_diff>

<commit_message>
Update the README layout and status; add the report PDF
</commit_message>
<xml_diff>
--- a/docs/PROJECT_REPORT.docx
+++ b/docs/PROJECT_REPORT.docx
@@ -17,17 +17,18 @@
         </w:rPr>
         <w:t>Project Report, Research Method in Computing</w:t>
       </w:r>
-      <w:r>
-        <w:t xml:space="preserve"> </w:t>
-      </w:r>
+    </w:p>
+    <w:p>
       <w:r>
         <w:rPr>
           <w:b/>
         </w:rPr>
         <w:t>MSU Summer 2026, Master's Final Project</w:t>
       </w:r>
+    </w:p>
+    <w:p>
       <w:r>
-        <w:t xml:space="preserve"> Mikko Palis</w:t>
+        <w:t>Mikko Palis</w:t>
       </w:r>
     </w:p>
     <w:p>

</xml_diff>

<commit_message>
Cite ResNet and ImageNet, attribute the CVC-300 subset to PraNet, cite MedSAM for zero-shot SAM; first-person abstract
</commit_message>
<xml_diff>
--- a/docs/PROJECT_REPORT.docx
+++ b/docs/PROJECT_REPORT.docx
@@ -142,7 +142,7 @@
         <w:t>Segmentation foundation models.</w:t>
       </w:r>
       <w:r>
-        <w:t xml:space="preserve"> SAM [4] trained a ViT image encoder and a promptable mask decoder on SA-1B, a corpus of 11M images and 1.1B masks. Zero-shot SAM segments natural images well but underperforms on medical imagery, where object boundaries follow tissue contrast rather than natural-image edges. MedSAM [5] fine-tuned SAM ViT-B on about 1.57M medical image-mask pairs across ten modalities and reported that it "ranked in first place on most tasks, surpassing the performance of the U-Net and DeepLabV3+ specialist models" [5], endoscopy among them, with one structural condition: every training step supplied a bounding-box prompt, and the specialist baselines in that comparison received the box as well. The model was never asked to localize an object on its own.</w:t>
+        <w:t xml:space="preserve"> SAM [4] trained a ViT image encoder and a promptable mask decoder on SA-1B, a corpus of 11M images and 1.1B masks. Zero-shot SAM segments natural images well but underperforms on medical imagery, where object boundaries follow tissue contrast rather than natural-image edges [5]. MedSAM [5] fine-tuned SAM ViT-B on about 1.57M medical image-mask pairs across ten modalities and reported that it "ranked in first place on most tasks, surpassing the performance of the U-Net and DeepLabV3+ specialist models" [5], endoscopy among them, with one structural condition: every training step supplied a bounding-box prompt, and the specialist baselines in that comparison received the box as well. The model was never asked to localize an object on its own.</w:t>
       </w:r>
     </w:p>
     <w:p>
@@ -527,7 +527,7 @@
           </w:tcPr>
           <w:p>
             <w:r>
-              <w:t>CVC-300 (EndoScene) [12]</w:t>
+              <w:t>CVC-300 (EndoScene [12]; 60-image test subset per [2, 15])</w:t>
             </w:r>
           </w:p>
         </w:tc>
@@ -650,7 +650,7 @@
           </w:tcPr>
           <w:p>
             <w:r>
-              <w:t>ResNet-34 encoder (ImageNet init)</w:t>
+              <w:t>ResNet-34 encoder, ImageNet init [21, 22]</w:t>
             </w:r>
           </w:p>
         </w:tc>
@@ -3511,6 +3511,34 @@
       </w:r>
     </w:p>
     <w:p>
+      <w:r>
+        <w:t xml:space="preserve">[21] K. He, X. Zhang, S. Ren, and J. Sun, "Deep residual learning for image recognition," in </w:t>
+      </w:r>
+      <w:r>
+        <w:rPr>
+          <w:i/>
+        </w:rPr>
+        <w:t>Proc. IEEE CVPR</w:t>
+      </w:r>
+      <w:r>
+        <w:t>, 2016, pp. 770–778.</w:t>
+      </w:r>
+    </w:p>
+    <w:p>
+      <w:r>
+        <w:t xml:space="preserve">[22] J. Deng, W. Dong, R. Socher, L.-J. Li, K. Li, and L. Fei-Fei, "ImageNet: A large-scale hierarchical image database," in </w:t>
+      </w:r>
+      <w:r>
+        <w:rPr>
+          <w:i/>
+        </w:rPr>
+        <w:t>Proc. IEEE CVPR</w:t>
+      </w:r>
+      <w:r>
+        <w:t>, 2009, pp. 248–255.</w:t>
+      </w:r>
+    </w:p>
+    <w:p>
       <w:pPr>
         <w:pStyle w:val="Heading2"/>
       </w:pPr>

</xml_diff>